<commit_message>
Sløjdopskrift: katapult med udløser
katapult.html med arbejdstegninger, stykliste og arbejdsgang, bygget af
claude/byg_katapult.py. Hele mekanikken er ét sæt mål, som både tegninger,
stykliste og tekst regnes ud af, og scriptet nægter at skrive filerne, hvis
geometrien ikke hænger sammen — stoppinden skal standse armen ved 45 grader,
elastikken skal strækkes nok og gå fri af stoppinden, og armens hale må ikke
lande på udløserstangen.

Nyt i figurer.py: klassen Rids, en målsat teknisk tegning i millimeter.

claude/byg_vejledning_docx.py tager nu kilde og udfil som argumenter og
gengiver alle figurer, så den kan bruges til begge vejledninger.
</commit_message>
<xml_diff>
--- a/vejledning/vejledning-plastik-og-foedevarer.docx
+++ b/vejledning/vejledning-plastik-og-foedevarer.docx
@@ -1493,7 +1493,7 @@
       <w:r>
         <w:drawing>
           <wp:inline xmlns:a="http://schemas.openxmlformats.org/drawingml/2006/main" xmlns:pic="http://schemas.openxmlformats.org/drawingml/2006/picture">
-            <wp:extent cx="5040000" cy="4765091"/>
+            <wp:extent cx="5400000" cy="5105455"/>
             <wp:docPr id="1" name="Picture 1"/>
             <wp:cNvGraphicFramePr>
               <a:graphicFrameLocks noChangeAspect="1"/>
@@ -1502,7 +1502,7 @@
               <a:graphicData uri="http://schemas.openxmlformats.org/drawingml/2006/picture">
                 <pic:pic>
                   <pic:nvPicPr>
-                    <pic:cNvPr id="0" name="vejledning-figur.png"/>
+                    <pic:cNvPr id="0" name="_vejl-figur0.png"/>
                     <pic:cNvPicPr/>
                   </pic:nvPicPr>
                   <pic:blipFill>
@@ -1514,7 +1514,7 @@
                   <pic:spPr>
                     <a:xfrm>
                       <a:off x="0" y="0"/>
-                      <a:ext cx="5040000" cy="4765091"/>
+                      <a:ext cx="5400000" cy="5105455"/>
                     </a:xfrm>
                     <a:prstGeom prst="rect"/>
                   </pic:spPr>

</xml_diff>

<commit_message>
Plastik-forløbet: brød i stedet for agurk, frysepose og madpapir
Co-Authored-By: Claude Fable 5.1 <noreply@anthropic.com>
Claude-Session: https://claude.ai/code/session_01QbC7jHxgDar7NiT99Z3gxW
</commit_message>
<xml_diff>
--- a/vejledning/vejledning-plastik-og-foedevarer.docx
+++ b/vejledning/vejledning-plastik-og-foedevarer.docx
@@ -1562,7 +1562,7 @@
           <w:color w:val="1A2233"/>
           <w:sz w:val="22"/>
         </w:rPr>
-        <w:t>Skær ikke agurk på forhånd. Den skal skæres på dagen, ellers er vægttabet startet, før forsøget er.</w:t>
+        <w:t>Skær ikke brød på forhånd. Det skal skæres på dagen, ellers er vægttabet startet, før forsøget er. Brug frisk franskbrød — tørt brød har ikke meget vand at miste, og så er der ingen forskel at se.</w:t>
       </w:r>
     </w:p>
     <w:p>
@@ -1815,7 +1815,7 @@
                 <w:color w:val="1A2233"/>
                 <w:sz w:val="20"/>
               </w:rPr>
-              <w:t>Agurk</w:t>
+              <w:t>Franskbrød</w:t>
             </w:r>
           </w:p>
         </w:tc>
@@ -1922,7 +1922,7 @@
                 <w:color w:val="1A2233"/>
                 <w:sz w:val="20"/>
               </w:rPr>
-              <w:t>Én agurk giver cirka 15 skiver på 1 cm</w:t>
+              <w:t>Ét franskbrød giver cirka 15 skiver på 1 cm</w:t>
             </w:r>
           </w:p>
         </w:tc>
@@ -2355,7 +2355,7 @@
                 <w:color w:val="1A2233"/>
                 <w:sz w:val="20"/>
               </w:rPr>
-              <w:t>Frysepose med lynlås</w:t>
+              <w:t>Frysepose</w:t>
             </w:r>
           </w:p>
         </w:tc>
@@ -2490,7 +2490,7 @@
                 <w:color w:val="1A2233"/>
                 <w:sz w:val="20"/>
               </w:rPr>
-              <w:t>Papirspose eller madpapir</w:t>
+              <w:t>Madpapir</w:t>
             </w:r>
           </w:p>
         </w:tc>
@@ -2517,7 +2517,7 @@
                 <w:color w:val="1A2233"/>
                 <w:sz w:val="20"/>
               </w:rPr>
-              <w:t>1 stk</w:t>
+              <w:t>1 ark</w:t>
             </w:r>
           </w:p>
         </w:tc>
@@ -2544,7 +2544,7 @@
                 <w:color w:val="1A2233"/>
                 <w:sz w:val="20"/>
               </w:rPr>
-              <w:t>12 stk</w:t>
+              <w:t>12 ark</w:t>
             </w:r>
           </w:p>
         </w:tc>
@@ -2571,7 +2571,7 @@
                 <w:color w:val="1A2233"/>
                 <w:sz w:val="20"/>
               </w:rPr>
-              <w:t>15 stk</w:t>
+              <w:t>15 ark</w:t>
             </w:r>
           </w:p>
         </w:tc>
@@ -2597,7 +2597,7 @@
                 <w:color w:val="1A2233"/>
                 <w:sz w:val="20"/>
               </w:rPr>
-              <w:t>Én pr. gruppe</w:t>
+              <w:t>Ét ark pr. gruppe — en rulle rækker til alle</w:t>
             </w:r>
           </w:p>
         </w:tc>
@@ -5295,7 +5295,7 @@
                 <w:color w:val="1A2233"/>
                 <w:sz w:val="20"/>
               </w:rPr>
-              <w:t>Papirspose</w:t>
+              <w:t>Madpapir</w:t>
             </w:r>
           </w:p>
         </w:tc>
@@ -5457,7 +5457,7 @@
                 <w:color w:val="1A2233"/>
                 <w:sz w:val="20"/>
               </w:rPr>
-              <w:t>Frysepose med lynlås</w:t>
+              <w:t>Frysepose</w:t>
             </w:r>
           </w:p>
         </w:tc>
@@ -5617,7 +5617,7 @@
           <w:color w:val="1A2233"/>
           <w:sz w:val="22"/>
         </w:rPr>
-        <w:t xml:space="preserve"> vej bioplasten, når den er tør, og regn ud hvor meget af massen der var vand. Eller lav en ekstra prøve med et stykke agurk i frysepose </w:t>
+        <w:t xml:space="preserve"> vej bioplasten, når den er tør, og regn ud hvor meget af massen der var vand. Eller lav en ekstra prøve med et skive brød i frysepose </w:t>
       </w:r>
       <w:r>
         <w:rPr>
@@ -5689,7 +5689,7 @@
           <w:color w:val="1A2233"/>
           <w:sz w:val="22"/>
         </w:rPr>
-        <w:t>Intet fra forsøgene må spises. Sig det ved velkomsten, og sig det igen, når agurken kommer frem.</w:t>
+        <w:t>Intet fra forsøgene må spises. Sig det ved velkomsten, og sig det igen, når brødet kommer frem.</w:t>
       </w:r>
     </w:p>
     <w:p>

</xml_diff>

<commit_message>
Plastik-forløbet: bioplast som forsøg 2, mikroovn i 2 minutter
Bioplasten laves nu før plastsorteringen, så filmen får resten af dagen
til at tørre. Den varmes i mikroovn i 2 minutter i alt, delt i fire gange
30 sekunder med omrøring tre gange undervejs. Kogepladen er ude af
udstyrslisten. Side, ungeark, vejledning (PDF og Word) er bygget om.

Co-Authored-By: Claude Fable 5.1 <noreply@anthropic.com>
Claude-Session: https://claude.ai/code/session_01QbC7jHxgDar7NiT99Z3gxW
</commit_message>
<xml_diff>
--- a/vejledning/vejledning-plastik-og-foedevarer.docx
+++ b/vejledning/vejledning-plastik-og-foedevarer.docx
@@ -1023,7 +1023,7 @@
                 <w:color w:val="1A2233"/>
                 <w:sz w:val="20"/>
               </w:rPr>
-              <w:t>0:45 – 1:30</w:t>
+              <w:t>0:45 – 1:45</w:t>
             </w:r>
           </w:p>
         </w:tc>
@@ -1049,7 +1049,7 @@
                 <w:color w:val="1A2233"/>
                 <w:sz w:val="20"/>
               </w:rPr>
-              <w:t>Forsøg 2 · Hvilken plast er det?</w:t>
+              <w:t>Forsøg 2 · Lav din egen bioplast</w:t>
             </w:r>
           </w:p>
         </w:tc>
@@ -1075,7 +1075,7 @@
                 <w:color w:val="1A2233"/>
                 <w:sz w:val="20"/>
               </w:rPr>
-              <w:t>Flyde-synke-test i vand og saltvand. Gæt først, mål bagefter, tjek koden til sidst.</w:t>
+              <w:t>Kartoffelmel, vand, glycerin og eddike varmes to minutter i mikroovnen til en film, der sættes til tørring.</w:t>
             </w:r>
           </w:p>
         </w:tc>
@@ -1103,7 +1103,7 @@
                 <w:color w:val="1A2233"/>
                 <w:sz w:val="20"/>
               </w:rPr>
-              <w:t>1:30 – 1:45</w:t>
+              <w:t>1:45 – 2:00</w:t>
             </w:r>
           </w:p>
         </w:tc>
@@ -1182,7 +1182,7 @@
                 <w:color w:val="1A2233"/>
                 <w:sz w:val="20"/>
               </w:rPr>
-              <w:t>1:45 – 2:45</w:t>
+              <w:t>2:00 – 2:45</w:t>
             </w:r>
           </w:p>
         </w:tc>
@@ -1208,7 +1208,7 @@
                 <w:color w:val="1A2233"/>
                 <w:sz w:val="20"/>
               </w:rPr>
-              <w:t>Forsøg 3 · Lav din egen bioplast</w:t>
+              <w:t>Forsøg 3 · Hvilken plast er det?</w:t>
             </w:r>
           </w:p>
         </w:tc>
@@ -1234,7 +1234,7 @@
                 <w:color w:val="1A2233"/>
                 <w:sz w:val="20"/>
               </w:rPr>
-              <w:t>Kartoffelmel, vand, glycerin og eddike koges til en film, der sættes til tørring.</w:t>
+              <w:t>Flyde-synke-test i vand og saltvand. Gæt først, mål bagefter, tjek koden til sidst.</w:t>
             </w:r>
           </w:p>
         </w:tc>
@@ -2867,7 +2867,7 @@
                 <w:color w:val="1A2233"/>
                 <w:sz w:val="20"/>
               </w:rPr>
-              <w:t>Ét til at blande, ét til at støbe</w:t>
+              <w:t>Ét til at blande og varme (skal tåle mikroovn), ét til at støbe</w:t>
             </w:r>
           </w:p>
         </w:tc>
@@ -3541,7 +3541,7 @@
                 <w:color w:val="1A2233"/>
                 <w:sz w:val="20"/>
               </w:rPr>
-              <w:t>Kogeplade eller mikroovn</w:t>
+              <w:t>Mikrobølgeovn</w:t>
             </w:r>
           </w:p>
         </w:tc>
@@ -3593,7 +3593,7 @@
                 <w:color w:val="1A2233"/>
                 <w:sz w:val="20"/>
               </w:rPr>
-              <w:t>Bioplasten skal varmes under omrøring.</w:t>
+              <w:t>Bioplasten varmes 2 minutter i alt, med omrøring tre gange undervejs.</w:t>
             </w:r>
           </w:p>
         </w:tc>
@@ -4147,7 +4147,7 @@
                 <w:color w:val="1A2233"/>
                 <w:sz w:val="20"/>
               </w:rPr>
-              <w:t>Stivelsesmassen er brandvarm.</w:t>
+              <w:t>Bægeret og stivelsesmassen er brandvarme, når de kommer ud af mikroovnen.</w:t>
             </w:r>
           </w:p>
         </w:tc>
@@ -4227,7 +4227,7 @@
                 <w:color w:val="1A2233"/>
                 <w:sz w:val="20"/>
               </w:rPr>
-              <w:t>Kun hvis I vil prøve den svære sortering. Må ikke være i nærheden af kogepladen.</w:t>
+              <w:t>Kun hvis I vil prøve den svære sortering. Må ikke stå ved mikroovnen.</w:t>
             </w:r>
           </w:p>
         </w:tc>
@@ -4251,7 +4251,7 @@
           <w:color w:val="1A2233"/>
           <w:sz w:val="28"/>
         </w:rPr>
-        <w:t>Forsøg 2 · facit til massefylde</w:t>
+        <w:t>Forsøg 3 · facit til massefylde</w:t>
       </w:r>
     </w:p>
     <w:p>
@@ -5665,7 +5665,7 @@
           <w:color w:val="1A2233"/>
           <w:sz w:val="22"/>
         </w:rPr>
-        <w:t>Stivelsesmassen bliver over 90 grader varm, og den klistrer — den er værre end kogende vand at få på huden. Handsker på, og kun spatel i gryden.</w:t>
+        <w:t>Stivelsesmassen bliver over 90 grader varm, og den klistrer — den er værre end kogende vand at få på huden. Bægeret er lige så varmt, når det kommer ud af mikroovnen. Handsker på, og kun spatel i bægeret.</w:t>
       </w:r>
     </w:p>
     <w:p>
@@ -5677,7 +5677,19 @@
           <w:color w:val="1A2233"/>
           <w:sz w:val="22"/>
         </w:rPr>
-        <w:t>Denatureret sprit er brandfarlig. Den skal stå i den anden ende af lokalet end kogepladen, og kun bruges, hvis I vælger den svære sortering.</w:t>
+        <w:t>Mikroovnen: 2 minutter i alt, delt i fire gange 30 sekunder med omrøring imellem. Kører den uafbrudt, koger massen over og brænder på i bunden.</w:t>
+      </w:r>
+    </w:p>
+    <w:p>
+      <w:r>
+        <w:rPr>
+          <w:rFonts w:ascii="Calibri" w:hAnsi="Calibri"/>
+          <w:b w:val="0"/>
+          <w:i w:val="0"/>
+          <w:color w:val="1A2233"/>
+          <w:sz w:val="22"/>
+        </w:rPr>
+        <w:t>Denatureret sprit er brandfarlig. Den skal stå i den anden ende af lokalet end mikroovnen, og kun bruges, hvis I vælger den svære sortering.</w:t>
       </w:r>
     </w:p>
     <w:p>
@@ -5729,7 +5741,7 @@
           <w:color w:val="1A2233"/>
           <w:sz w:val="22"/>
         </w:rPr>
-        <w:t>Smid de gamle madprøver ud med det samme — de lugter dagen efter. Saltvandet kan genbruges; hæld det tilbage i dunken gennem et kaffefilter. Bioplasten skal blive liggende, til den er tør: lad den ligge natten over, og lad ungerne hente den næste dag, hvis de har tid.</w:t>
+        <w:t>Smid de gamle madprøver ud med det samme — de lugter dagen efter. Saltvandet kan genbruges; hæld det tilbage i dunken gennem et kaffefilter. Bioplasten laves nu tidligt på dagen, så den tynde film er som regel tør, når holdet går hjem. Er den ikke, så lad den ligge natten over, og lad ungerne hente den næste dag.</w:t>
       </w:r>
     </w:p>
     <w:p>

</xml_diff>